<commit_message>
Committing baseline for job duties
</commit_message>
<xml_diff>
--- a/%PATH_EE267%/Documents/Resumes_final/Baron Eiley Resume.docx
+++ b/%PATH_EE267%/Documents/Resumes_final/Baron Eiley Resume.docx
@@ -539,7 +539,27 @@
           <w:sz w:val="18"/>
           <w:szCs w:val="18"/>
         </w:rPr>
-        <w:t xml:space="preserve"> custom RTL designs for validation and checkout of algorithms on FPGA chip.</w:t>
+        <w:t xml:space="preserve"> custom RTL designs for validation and checkout of algorithms on FPGA </w:t>
+      </w:r>
+      <w:proofErr w:type="gramStart"/>
+      <w:r>
+        <w:rPr>
+          <w:rFonts w:ascii="Verdana" w:hAnsi="Verdana"/>
+          <w:color w:val="000000"/>
+          <w:sz w:val="18"/>
+          <w:szCs w:val="18"/>
+        </w:rPr>
+        <w:t>chip</w:t>
+      </w:r>
+      <w:proofErr w:type="gramEnd"/>
+      <w:r>
+        <w:rPr>
+          <w:rFonts w:ascii="Verdana" w:hAnsi="Verdana"/>
+          <w:color w:val="000000"/>
+          <w:sz w:val="18"/>
+          <w:szCs w:val="18"/>
+        </w:rPr>
+        <w:t>.</w:t>
       </w:r>
     </w:p>
     <w:p>
@@ -694,7 +714,27 @@
           <w:sz w:val="18"/>
           <w:szCs w:val="18"/>
         </w:rPr>
-        <w:t xml:space="preserve">Developed custom scripting language using C# to command and control special read out integrated circuits within highly sensitive Geiger Mode Avalanche Photo-Diode sensors. </w:t>
+        <w:t xml:space="preserve">Developed custom scripting language using C# to </w:t>
+      </w:r>
+      <w:proofErr w:type="gramStart"/>
+      <w:r>
+        <w:rPr>
+          <w:rFonts w:ascii="Verdana" w:hAnsi="Verdana"/>
+          <w:color w:val="000000"/>
+          <w:sz w:val="18"/>
+          <w:szCs w:val="18"/>
+        </w:rPr>
+        <w:t>command and control</w:t>
+      </w:r>
+      <w:proofErr w:type="gramEnd"/>
+      <w:r>
+        <w:rPr>
+          <w:rFonts w:ascii="Verdana" w:hAnsi="Verdana"/>
+          <w:color w:val="000000"/>
+          <w:sz w:val="18"/>
+          <w:szCs w:val="18"/>
+        </w:rPr>
+        <w:t xml:space="preserve"> special read out integrated circuits within highly sensitive Geiger Mode Avalanche Photo-Diode sensors. </w:t>
       </w:r>
     </w:p>
     <w:p>
@@ -932,7 +972,27 @@
           <w:sz w:val="18"/>
           <w:szCs w:val="18"/>
         </w:rPr>
-        <w:t>Reviewed screening and test data received from manufacturers and test laboratories for compliance to specifications, purchase order requirements and program contracts.</w:t>
+        <w:t xml:space="preserve">Reviewed screening and test data received from manufacturers and test laboratories for compliance </w:t>
+      </w:r>
+      <w:proofErr w:type="gramStart"/>
+      <w:r>
+        <w:rPr>
+          <w:rFonts w:ascii="Verdana" w:hAnsi="Verdana"/>
+          <w:color w:val="000000"/>
+          <w:sz w:val="18"/>
+          <w:szCs w:val="18"/>
+        </w:rPr>
+        <w:t>to</w:t>
+      </w:r>
+      <w:proofErr w:type="gramEnd"/>
+      <w:r>
+        <w:rPr>
+          <w:rFonts w:ascii="Verdana" w:hAnsi="Verdana"/>
+          <w:color w:val="000000"/>
+          <w:sz w:val="18"/>
+          <w:szCs w:val="18"/>
+        </w:rPr>
+        <w:t xml:space="preserve"> specifications, purchase order requirements and program contracts.</w:t>
       </w:r>
     </w:p>
     <w:p>
@@ -1333,7 +1393,27 @@
           <w:sz w:val="16"/>
           <w:szCs w:val="16"/>
         </w:rPr>
-        <w:t>mplemented on the Xilinx Pynq Z1 FPGA</w:t>
+        <w:t xml:space="preserve">mplemented on the Xilinx </w:t>
+      </w:r>
+      <w:proofErr w:type="spellStart"/>
+      <w:r>
+        <w:rPr>
+          <w:rFonts w:ascii="Verdana" w:hAnsi="Verdana"/>
+          <w:color w:val="000000"/>
+          <w:sz w:val="16"/>
+          <w:szCs w:val="16"/>
+        </w:rPr>
+        <w:t>Pynq</w:t>
+      </w:r>
+      <w:proofErr w:type="spellEnd"/>
+      <w:r>
+        <w:rPr>
+          <w:rFonts w:ascii="Verdana" w:hAnsi="Verdana"/>
+          <w:color w:val="000000"/>
+          <w:sz w:val="16"/>
+          <w:szCs w:val="16"/>
+        </w:rPr>
+        <w:t xml:space="preserve"> Z1 FPGA</w:t>
       </w:r>
     </w:p>
     <w:p>
@@ -1367,7 +1447,27 @@
           <w:sz w:val="18"/>
           <w:szCs w:val="18"/>
         </w:rPr>
-        <w:t>Implemented On a Custom Search &amp; Rescue Drone</w:t>
+        <w:t xml:space="preserve">Implemented </w:t>
+      </w:r>
+      <w:proofErr w:type="gramStart"/>
+      <w:r>
+        <w:rPr>
+          <w:rFonts w:ascii="Verdana" w:hAnsi="Verdana"/>
+          <w:color w:val="000000"/>
+          <w:sz w:val="18"/>
+          <w:szCs w:val="18"/>
+        </w:rPr>
+        <w:t>On</w:t>
+      </w:r>
+      <w:proofErr w:type="gramEnd"/>
+      <w:r>
+        <w:rPr>
+          <w:rFonts w:ascii="Verdana" w:hAnsi="Verdana"/>
+          <w:color w:val="000000"/>
+          <w:sz w:val="18"/>
+          <w:szCs w:val="18"/>
+        </w:rPr>
+        <w:t xml:space="preserve"> a Custom Search &amp; Rescue Drone</w:t>
       </w:r>
     </w:p>
     <w:p>
@@ -1544,7 +1644,27 @@
           <w:sz w:val="18"/>
           <w:szCs w:val="18"/>
         </w:rPr>
-        <w:t xml:space="preserve"> Verilog, SystemVerilog, and VHDL HDL Design</w:t>
+        <w:t xml:space="preserve"> Verilog, </w:t>
+      </w:r>
+      <w:proofErr w:type="spellStart"/>
+      <w:r>
+        <w:rPr>
+          <w:rFonts w:ascii="Verdana" w:hAnsi="Verdana"/>
+          <w:color w:val="000000"/>
+          <w:sz w:val="18"/>
+          <w:szCs w:val="18"/>
+        </w:rPr>
+        <w:t>SystemVerilog</w:t>
+      </w:r>
+      <w:proofErr w:type="spellEnd"/>
+      <w:r>
+        <w:rPr>
+          <w:rFonts w:ascii="Verdana" w:hAnsi="Verdana"/>
+          <w:color w:val="000000"/>
+          <w:sz w:val="18"/>
+          <w:szCs w:val="18"/>
+        </w:rPr>
+        <w:t>, and VHDL HDL Design</w:t>
       </w:r>
     </w:p>
     <w:p>
@@ -1599,6 +1719,7 @@
           <w:szCs w:val="18"/>
         </w:rPr>
       </w:pPr>
+      <w:proofErr w:type="spellStart"/>
       <w:r>
         <w:rPr>
           <w:rFonts w:ascii="Verdana" w:hAnsi="Verdana"/>
@@ -1610,6 +1731,7 @@
         </w:rPr>
         <w:t>QuestaSim</w:t>
       </w:r>
+      <w:proofErr w:type="spellEnd"/>
       <w:r>
         <w:rPr>
           <w:rFonts w:ascii="Verdana" w:hAnsi="Verdana"/>
@@ -5016,6 +5138,21 @@
 </file>
 
 <file path=customXml/item1.xml><?xml version="1.0" encoding="utf-8"?>
+<?mso-contentType ?>
+<FormTemplates xmlns="http://schemas.microsoft.com/sharepoint/v3/contenttype/forms">
+  <Display>DocumentLibraryForm</Display>
+  <Edit>DocumentLibraryForm</Edit>
+  <New>DocumentLibraryForm</New>
+</FormTemplates>
+</file>
+
+<file path=customXml/item2.xml><?xml version="1.0" encoding="utf-8"?>
+<p:properties xmlns:p="http://schemas.microsoft.com/office/2006/metadata/properties" xmlns:xsi="http://www.w3.org/2001/XMLSchema-instance" xmlns:pc="http://schemas.microsoft.com/office/infopath/2007/PartnerControls">
+  <documentManagement/>
+</p:properties>
+</file>
+
+<file path=customXml/item3.xml><?xml version="1.0" encoding="utf-8"?>
 <ct:contentTypeSchema xmlns:ct="http://schemas.microsoft.com/office/2006/metadata/contentType" xmlns:ma="http://schemas.microsoft.com/office/2006/metadata/properties/metaAttributes" ct:_="" ma:_="" ma:contentTypeName="Document" ma:contentTypeID="0x010100867EABB79E639D419F3561FC1B55885E" ma:contentTypeVersion="8" ma:contentTypeDescription="Create a new document." ma:contentTypeScope="" ma:versionID="9b8f4618c88f8e0b4eb563b4cdba7a25">
   <xsd:schema xmlns:xsd="http://www.w3.org/2001/XMLSchema" xmlns:xs="http://www.w3.org/2001/XMLSchema" xmlns:p="http://schemas.microsoft.com/office/2006/metadata/properties" xmlns:ns3="52f95501-b86c-4538-939e-c7b1fca8985d" xmlns:ns4="7aa2ff15-a8d9-41ca-8ce8-8965e225dba8" targetNamespace="http://schemas.microsoft.com/office/2006/metadata/properties" ma:root="true" ma:fieldsID="4460740b4ffe848c3d514de27975c134" ns3:_="" ns4:_="">
     <xsd:import namespace="52f95501-b86c-4538-939e-c7b1fca8985d"/>
@@ -5206,22 +5343,24 @@
 </ct:contentTypeSchema>
 </file>
 
-<file path=customXml/item2.xml><?xml version="1.0" encoding="utf-8"?>
-<p:properties xmlns:p="http://schemas.microsoft.com/office/2006/metadata/properties" xmlns:xsi="http://www.w3.org/2001/XMLSchema-instance" xmlns:pc="http://schemas.microsoft.com/office/infopath/2007/PartnerControls">
-  <documentManagement/>
-</p:properties>
+<file path=customXml/itemProps1.xml><?xml version="1.0" encoding="utf-8"?>
+<ds:datastoreItem xmlns:ds="http://schemas.openxmlformats.org/officeDocument/2006/customXml" ds:itemID="{E9A4FFFC-63F3-4EDB-9AB0-D03C0B8CDA58}">
+  <ds:schemaRefs>
+    <ds:schemaRef ds:uri="http://schemas.microsoft.com/sharepoint/v3/contenttype/forms"/>
+  </ds:schemaRefs>
+</ds:datastoreItem>
 </file>
 
-<file path=customXml/item3.xml><?xml version="1.0" encoding="utf-8"?>
-<?mso-contentType ?>
-<FormTemplates xmlns="http://schemas.microsoft.com/sharepoint/v3/contenttype/forms">
-  <Display>DocumentLibraryForm</Display>
-  <Edit>DocumentLibraryForm</Edit>
-  <New>DocumentLibraryForm</New>
-</FormTemplates>
+<file path=customXml/itemProps2.xml><?xml version="1.0" encoding="utf-8"?>
+<ds:datastoreItem xmlns:ds="http://schemas.openxmlformats.org/officeDocument/2006/customXml" ds:itemID="{13AFB88A-A821-4CEC-B8E9-75A5A58AB48F}">
+  <ds:schemaRefs>
+    <ds:schemaRef ds:uri="http://schemas.microsoft.com/office/2006/metadata/properties"/>
+    <ds:schemaRef ds:uri="http://schemas.microsoft.com/office/infopath/2007/PartnerControls"/>
+  </ds:schemaRefs>
+</ds:datastoreItem>
 </file>
 
-<file path=customXml/itemProps1.xml><?xml version="1.0" encoding="utf-8"?>
+<file path=customXml/itemProps3.xml><?xml version="1.0" encoding="utf-8"?>
 <ds:datastoreItem xmlns:ds="http://schemas.openxmlformats.org/officeDocument/2006/customXml" ds:itemID="{7810582A-6560-4E6F-AB14-82514580EDE4}">
   <ds:schemaRefs>
     <ds:schemaRef ds:uri="http://schemas.microsoft.com/office/2006/metadata/contentType"/>
@@ -5238,21 +5377,4 @@
     <ds:schemaRef ds:uri="http://schemas.microsoft.com/internal/obd"/>
   </ds:schemaRefs>
 </ds:datastoreItem>
-</file>
-
-<file path=customXml/itemProps2.xml><?xml version="1.0" encoding="utf-8"?>
-<ds:datastoreItem xmlns:ds="http://schemas.openxmlformats.org/officeDocument/2006/customXml" ds:itemID="{13AFB88A-A821-4CEC-B8E9-75A5A58AB48F}">
-  <ds:schemaRefs>
-    <ds:schemaRef ds:uri="http://schemas.microsoft.com/office/2006/metadata/properties"/>
-    <ds:schemaRef ds:uri="http://schemas.microsoft.com/office/infopath/2007/PartnerControls"/>
-  </ds:schemaRefs>
-</ds:datastoreItem>
-</file>
-
-<file path=customXml/itemProps3.xml><?xml version="1.0" encoding="utf-8"?>
-<ds:datastoreItem xmlns:ds="http://schemas.openxmlformats.org/officeDocument/2006/customXml" ds:itemID="{E9A4FFFC-63F3-4EDB-9AB0-D03C0B8CDA58}">
-  <ds:schemaRefs>
-    <ds:schemaRef ds:uri="http://schemas.microsoft.com/sharepoint/v3/contenttype/forms"/>
-  </ds:schemaRefs>
-</ds:datastoreItem>
 </file>
</xml_diff>